<commit_message>
Report: add the open-model planner results to M5 (Table VIII)
Qwen 2.5 7B on one T4 GPU (AWS g4dn.xlarge via NUS RONIN), 20 riskiest
restaurants: 33/48 claims verified (69%) vs 100% rule-based and 0%
adversarial. Updates the abstract, contributions, Sec. III-F (three
planners), Table III, Table VIII and its discussion, system performance and
conclusions; Figs. 1-2 now say "LLM" instead of "Claude".

inputs/m5_planner_comparison.json is the new --compare 20 output;
inputs/m5_open_model_summary.json aggregates the open-model plans (no
review text).

Co-Authored-By: Claude Opus 5.5 <noreply@anthropic.com>
</commit_message>
<xml_diff>
--- a/docs/report/Group10-report-DSA2111.docx
+++ b/docs/report/Group10-report-DSA2111.docx
@@ -105,7 +105,7 @@
           <w:i w:val="0"/>
           <w:sz w:val="18"/>
         </w:rPr>
-        <w:t>Online ratings drive restaurant revenue, yet owners usually discover a reputation problem only after their average rating has already fallen, and the aggregate score never says what to fix. Existing research predicts permanent business failure from rating sequences, and commercial review analytics report overall sentiment; both describe the past and stop at diagnosis. We present Radview, a cloud-native system that warns owners of an impending rating decline and tells them, with cited review evidence, which operational problem to address first. Radview streams the Yelp Open Dataset, labels every review's sentiment toward food, service, cleanliness, price and ambience with a DistilBERT model fine-tuned by weak supervision, tracks aspect-level complaint rates with robust control charts, and forecasts a statistically significant 0.3-star decline over the next three months with a calibrated PyTorch GRU over twelve-month feature sequences. Forecasts are explained twice, by SHAP and by a counterfactual intervention, and an agent built with LangGraph turns them into a ranked action plan whose every claim is checked by a mechanical five-axis verifier before an owner sees it. The system runs as Docker containers on Kubernetes behind a REST API and an owner dashboard. On 152,649 reviews of 397 Philadelphia restaurants (2016–2021), the aspect model reaches macro-F1 0.737 and complaint-F1 0.567 on human-labelled SemEval-2014 sentences, ahead of TF-IDF and lexicon baselines; all 265 claims in 53 real action plans pass verification while 100% of claims from an adversarial planner are rejected. On an out-of-time, COVID-era test period the GRU (AUROC 0.727) is the best learned multi-signal model, but a rating-trend logistic regression is marginally better (0.738), and complaint spikes do not anticipate declines at monthly granularity. We report these negative results and discuss why.</w:t>
+        <w:t>Online ratings drive restaurant revenue, yet owners usually discover a reputation problem only after their average rating has already fallen, and the aggregate score never says what to fix. Existing research predicts permanent business failure from rating sequences, and commercial review analytics report overall sentiment; both describe the past and stop at diagnosis. We present Radview, a cloud-native system that warns owners of an impending rating decline and tells them, with cited review evidence, which operational problem to address first. Radview streams the Yelp Open Dataset, labels every review's sentiment toward food, service, cleanliness, price and ambience with a DistilBERT model fine-tuned by weak supervision, tracks aspect-level complaint rates with robust control charts, and forecasts a statistically significant 0.3-star decline over the next three months with a calibrated PyTorch GRU over twelve-month feature sequences. Forecasts are explained twice, by SHAP and by a counterfactual intervention, and an agent built with LangGraph turns them into a ranked action plan whose every claim is checked by a mechanical five-axis verifier before an owner sees it. The system runs as Docker containers on Kubernetes behind a REST API and an owner dashboard. On 152,649 reviews of 397 Philadelphia restaurants (2016–2021), the aspect model reaches macro-F1 0.737 and complaint-F1 0.567 on human-labelled SemEval-2014 sentences, ahead of TF-IDF and lexicon baselines; all 265 claims in 53 real action plans pass verification while 100% of claims from an adversarial planner are rejected, and a free open model (Qwen 2.5 7B) acting as the agent gets only 69% of its claims verified. On an out-of-time, COVID-era test period the GRU (AUROC 0.727) is the best learned multi-signal model, but a rating-trend logistic regression is marginally better (0.738), and complaint spikes do not anticipate declines at monthly granularity. We report these negative results and discuss why.</w:t>
       </w:r>
     </w:p>
     <w:p>
@@ -521,7 +521,7 @@
           <w:b w:val="0"/>
           <w:i w:val="0"/>
         </w:rPr>
-        <w:t xml:space="preserve"> A LangGraph agent in which Claude chooses which analytics tools to call, with a deterministic planner as fallback and baseline; every claim is checked for citation, verbatim quotation, aspect relevance, numeric fidelity and substance, and an adversarial planner demonstrates that fabrications are rejected.</w:t>
+        <w:t xml:space="preserve"> A LangGraph agent in which an LLM — Claude, or a free open-weight model served on our own GPU — chooses which analytics tools to call, with a deterministic planner as fallback and baseline; every claim is checked for citation, verbatim quotation, aspect relevance, numeric fidelity and substance, and an adversarial planner demonstrates that fabrications are rejected.</w:t>
       </w:r>
     </w:p>
     <w:p>
@@ -3094,7 +3094,7 @@
       <w:r>
         <w:drawing>
           <wp:inline xmlns:a="http://schemas.openxmlformats.org/drawingml/2006/main" xmlns:pic="http://schemas.openxmlformats.org/drawingml/2006/picture">
-            <wp:extent cx="3154680" cy="1910732"/>
+            <wp:extent cx="3154680" cy="1912906"/>
             <wp:docPr id="2" name="Picture 2"/>
             <wp:cNvGraphicFramePr>
               <a:graphicFrameLocks noChangeAspect="1"/>
@@ -3115,7 +3115,7 @@
                   <pic:spPr>
                     <a:xfrm>
                       <a:off x="0" y="0"/>
-                      <a:ext cx="3154680" cy="1910732"/>
+                      <a:ext cx="3154680" cy="1912906"/>
                     </a:xfrm>
                     <a:prstGeom prst="rect"/>
                   </pic:spPr>
@@ -3145,7 +3145,7 @@
           <w:i w:val="0"/>
           <w:sz w:val="16"/>
         </w:rPr>
-        <w:t>M5 agent workflow. The Claude planner may redraft once when claims fail verification; unverified claims never reach the owner but are logged.</w:t>
+        <w:t>M5 agent workflow. An LLM planner (Claude or the open model) may redraft once when claims fail verification; unverified claims never reach the owner but are logged.</w:t>
       </w:r>
     </w:p>
     <w:p>
@@ -3159,7 +3159,7 @@
           <w:b w:val="0"/>
           <w:i w:val="0"/>
         </w:rPr>
-        <w:t xml:space="preserve">Two planners sit behind the </w:t>
+        <w:t xml:space="preserve">Three planners sit behind the </w:t>
       </w:r>
       <w:r>
         <w:rPr>
@@ -3188,6 +3188,20 @@
           <w:i w:val="0"/>
         </w:rPr>
         <w:t xml:space="preserve"> receives the pre-ranked priorities and the tool definitions and runs its own tool-calling loop — for instance fetching evidence for an aspect the analytics did not rank first — then submits the plan through a strict JSON-schema tool; every evidence ID it sees is recorded. The </w:t>
+      </w:r>
+      <w:r>
+        <w:rPr>
+          <w:b/>
+          <w:i w:val="0"/>
+        </w:rPr>
+        <w:t>open-model planner</w:t>
+      </w:r>
+      <w:r>
+        <w:rPr>
+          <w:b w:val="0"/>
+          <w:i w:val="0"/>
+        </w:rPr>
+        <w:t xml:space="preserve"> runs the same prompt, tools and loop against a free open-weight model (Qwen 2.5 7B) served by Ollama through an OpenAI-compatible API, so it needs no API key, has no per-token cost and keeps reviews on the group's own server; it repairs only output-format slips (e.g. tool arguments sent as strings) and, when greedy decoding falls into a repetition loop that the server aborts, retries that turn once at temperature 0.4. The </w:t>
       </w:r>
       <w:r>
         <w:rPr>
@@ -3733,7 +3747,7 @@
                 <w:i w:val="0"/>
                 <w:sz w:val="15"/>
               </w:rPr>
-              <w:t>LangGraph, Anthropic SDK (Claude)</w:t>
+              <w:t>LangGraph, Anthropic SDK (Claude), Ollama (Qwen 2.5 7B)</w:t>
             </w:r>
           </w:p>
         </w:tc>
@@ -6929,7 +6943,7 @@
                 <w:i w:val="0"/>
                 <w:sz w:val="14"/>
               </w:rPr>
-              <w:t>rule-based</w:t>
+              <w:t>Rule-based</w:t>
             </w:r>
           </w:p>
         </w:tc>
@@ -7071,6 +7085,160 @@
         <w:tc>
           <w:tcPr>
             <w:tcW w:type="dxa" w:w="1037"/>
+          </w:tcPr>
+          <w:p>
+            <w:pPr>
+              <w:keepNext/>
+              <w:jc w:val="left"/>
+            </w:pPr>
+            <w:r>
+              <w:rPr>
+                <w:b w:val="0"/>
+                <w:i w:val="0"/>
+                <w:sz w:val="14"/>
+              </w:rPr>
+              <w:t>Qwen 2.5 7B</w:t>
+            </w:r>
+          </w:p>
+        </w:tc>
+        <w:tc>
+          <w:tcPr>
+            <w:tcW w:type="dxa" w:w="806"/>
+          </w:tcPr>
+          <w:p>
+            <w:pPr>
+              <w:keepNext/>
+              <w:jc w:val="center"/>
+            </w:pPr>
+            <w:r>
+              <w:rPr>
+                <w:b w:val="0"/>
+                <w:i w:val="0"/>
+                <w:sz w:val="14"/>
+              </w:rPr>
+              <w:t>69%</w:t>
+            </w:r>
+          </w:p>
+        </w:tc>
+        <w:tc>
+          <w:tcPr>
+            <w:tcW w:type="dxa" w:w="634"/>
+          </w:tcPr>
+          <w:p>
+            <w:pPr>
+              <w:keepNext/>
+              <w:jc w:val="center"/>
+            </w:pPr>
+            <w:r>
+              <w:rPr>
+                <w:b w:val="0"/>
+                <w:i w:val="0"/>
+                <w:sz w:val="14"/>
+              </w:rPr>
+              <w:t>48</w:t>
+            </w:r>
+          </w:p>
+        </w:tc>
+        <w:tc>
+          <w:tcPr>
+            <w:tcW w:type="dxa" w:w="490"/>
+          </w:tcPr>
+          <w:p>
+            <w:pPr>
+              <w:keepNext/>
+              <w:jc w:val="center"/>
+            </w:pPr>
+            <w:r>
+              <w:rPr>
+                <w:b w:val="0"/>
+                <w:i w:val="0"/>
+                <w:sz w:val="14"/>
+              </w:rPr>
+              <w:t>8</w:t>
+            </w:r>
+          </w:p>
+        </w:tc>
+        <w:tc>
+          <w:tcPr>
+            <w:tcW w:type="dxa" w:w="490"/>
+          </w:tcPr>
+          <w:p>
+            <w:pPr>
+              <w:keepNext/>
+              <w:jc w:val="center"/>
+            </w:pPr>
+            <w:r>
+              <w:rPr>
+                <w:b w:val="0"/>
+                <w:i w:val="0"/>
+                <w:sz w:val="14"/>
+              </w:rPr>
+              <w:t>8</w:t>
+            </w:r>
+          </w:p>
+        </w:tc>
+        <w:tc>
+          <w:tcPr>
+            <w:tcW w:type="dxa" w:w="490"/>
+          </w:tcPr>
+          <w:p>
+            <w:pPr>
+              <w:keepNext/>
+              <w:jc w:val="center"/>
+            </w:pPr>
+            <w:r>
+              <w:rPr>
+                <w:b w:val="0"/>
+                <w:i w:val="0"/>
+                <w:sz w:val="14"/>
+              </w:rPr>
+              <w:t>0</w:t>
+            </w:r>
+          </w:p>
+        </w:tc>
+        <w:tc>
+          <w:tcPr>
+            <w:tcW w:type="dxa" w:w="490"/>
+          </w:tcPr>
+          <w:p>
+            <w:pPr>
+              <w:keepNext/>
+              <w:jc w:val="center"/>
+            </w:pPr>
+            <w:r>
+              <w:rPr>
+                <w:b w:val="0"/>
+                <w:i w:val="0"/>
+                <w:sz w:val="14"/>
+              </w:rPr>
+              <w:t>1</w:t>
+            </w:r>
+          </w:p>
+        </w:tc>
+        <w:tc>
+          <w:tcPr>
+            <w:tcW w:type="dxa" w:w="461"/>
+          </w:tcPr>
+          <w:p>
+            <w:pPr>
+              <w:keepNext/>
+              <w:jc w:val="center"/>
+            </w:pPr>
+            <w:r>
+              <w:rPr>
+                <w:b w:val="0"/>
+                <w:i w:val="0"/>
+                <w:sz w:val="14"/>
+              </w:rPr>
+              <w:t>6</w:t>
+            </w:r>
+          </w:p>
+        </w:tc>
+      </w:tr>
+      <w:tr>
+        <w:tc>
+          <w:tcPr>
+            <w:tcW w:type="dxa" w:w="1037"/>
             <w:tcBorders>
               <w:bottom w:val="single" w:sz="8" w:color="000000"/>
             </w:tcBorders>
@@ -7086,7 +7254,7 @@
                 <w:i w:val="0"/>
                 <w:sz w:val="14"/>
               </w:rPr>
-              <w:t>adversarial</w:t>
+              <w:t>Adversarial</w:t>
             </w:r>
           </w:p>
         </w:tc>
@@ -7256,7 +7424,7 @@
           <w:i/>
           <w:sz w:val="14"/>
         </w:rPr>
-        <w:t>Last five columns: claims rejected on each verifier axis (a claim can fail several). The Claude planner could not be run: no API key was available.</w:t>
+        <w:t>Last five columns: claims rejected on each verifier axis (a claim can fail several). Qwen 2.5 7B ran through Ollama on one NVIDIA T4 GPU (AWS g4dn.xlarge via NUS RONIN). The Claude planner could not be run: no API key was available.</w:t>
       </w:r>
     </w:p>
     <w:p>
@@ -7275,19 +7443,7 @@
           <w:b w:val="0"/>
           <w:i w:val="0"/>
         </w:rPr>
-        <w:t>Across all 53 at-risk restaurants, the rule-based planner produced 265 claims and all of them passed the verifier, with a median latency of 0.27 s per plan. This is expected by construction — the planner only restates tool outputs — so the verifier's value is shown by the adversarial planner (Table VIII): every one of its 160 fabricated claims was rejected, and every axis fired, from invented review IDs (citation) to quoted praise passed off as complaints (relevance). Inspecting real plans exposed two issues we then fixed: rates such as "33% of reviews" can mean one of three reviews in the sparse late-2021 data, so plans now state counts and add a small-sample caveat below ten reviews; and generic keywords led some actions to default to generic advice. The Claude planner is fully implemented and its fallback is tested, but measuring its groundedness, latency and cost requires an API key that was not available.</w:t>
-      </w:r>
-    </w:p>
-    <w:p>
-      <w:pPr>
-        <w:keepNext/>
-        <w:spacing w:before="100" w:after="40"/>
-      </w:pPr>
-      <w:r>
-        <w:rPr>
-          <w:i/>
-        </w:rPr>
-        <w:t>H. Comparison with Existing Methods and System Performance</w:t>
+        <w:t>Across all 53 at-risk restaurants, the rule-based planner produced 265 claims and all of them passed the verifier, with a median latency of 0.27 s per plan. This is expected by construction — the planner only restates tool outputs — so the verifier's value is shown by the adversarial planner (Table VIII): every one of its 160 fabricated claims was rejected, and every axis fired, from invented review IDs (citation) to quoted praise passed off as complaints (relevance). Inspecting real plans exposed two issues we then fixed: rates such as "33% of reviews" can mean one of three reviews in the sparse late-2021 data, so plans now state counts and add a small-sample caveat below ten reviews; and generic keywords led some actions to default to generic advice.</w:t>
       </w:r>
     </w:p>
     <w:p>
@@ -7301,7 +7457,33 @@
           <w:b w:val="0"/>
           <w:i w:val="0"/>
         </w:rPr>
-        <w:t>Direct numerical comparison with [4] and [5] would be misleading: both predict permanent closure, an outcome with a much stronger and longer-lasting signal than a three-month rating decline, and [5] uses a random rather than chronological split, which can inflate results through temporal leakage [22]. Qualitatively, Radview adds what both papers leave as future work — aspect-level causes and recommendations — at the cost of a harder, noisier target, and our AUROC of 0.73–0.74 on that target is consistent with the gap between the tasks. Operationally, fine-tuning DistilBERT took 54 minutes and scoring all 152,649 reviews 52 minutes on CPU; training and evaluating all seven forecasters takes under two minutes; a plan takes a quarter of a second. The test-gated Docker image is 3.6 GB, and the full stack ran on Docker Desktop's single-node Kubernetes cluster once resource requests were sized to its 6.8 GiB of allocatable memory; the 23-test suite passes against the real outputs.</w:t>
+        <w:t>The open-model planner shows why the verifier is needed. Qwen 2.5 7B behaved as an agent — beyond the fixed analytics calls it chose 4.4 further tool calls per plan, mostly to fetch more review evidence or compare peers — but only 33 of its 48 final claims (68.8%) passed verification. Of the 20 plans, 12 were fully grounded and 8 needed a redraft after verifier feedback, but 4 ended with no verified claim. The rejected claims were mainly paraphrases presented as quotations (8), metric claims with no checkable figure (6; e.g. "Our cleanliness score is currently at the market median.") and citations of reviews that were never retrieved, including invented identifiers such as "r123"; one stated a statistic the tools never returned ("Our food quality is below the market median, with a 24.8% lower complaint rate compared to peers."). Owners therefore saw 11 action items backed by a verified quotation, against 24 from the rule-based planner. A plan took a median of 14.5 s and about 5,980 tokens on one T4 GPU, at no per-token cost, and its actions were largely adapted from the playbook. On this evidence a 7-billion-parameter open model adds investigative flexibility but not more specific advice, and is only safe to show owners behind the verifier; the Claude planner is implemented and tested but could not be measured without an API key.</w:t>
+      </w:r>
+    </w:p>
+    <w:p>
+      <w:pPr>
+        <w:keepNext/>
+        <w:spacing w:before="100" w:after="40"/>
+      </w:pPr>
+      <w:r>
+        <w:rPr>
+          <w:i/>
+        </w:rPr>
+        <w:t>H. Comparison with Existing Methods and System Performance</w:t>
+      </w:r>
+    </w:p>
+    <w:p>
+      <w:pPr>
+        <w:spacing w:after="0"/>
+        <w:ind w:firstLine="245"/>
+        <w:jc w:val="both"/>
+      </w:pPr>
+      <w:r>
+        <w:rPr>
+          <w:b w:val="0"/>
+          <w:i w:val="0"/>
+        </w:rPr>
+        <w:t>Direct numerical comparison with [4] and [5] would be misleading: both predict permanent closure, an outcome with a much stronger and longer-lasting signal than a three-month rating decline, and [5] uses a random rather than chronological split, which can inflate results through temporal leakage [22]. Qualitatively, Radview adds what both papers leave as future work — aspect-level causes and recommendations — at the cost of a harder, noisier target, and our AUROC of 0.73–0.74 on that target is consistent with the gap between the tasks. Operationally, fine-tuning DistilBERT took 54 minutes and scoring all 152,649 reviews 52 minutes on CPU; training and evaluating all seven forecasters takes under two minutes; a rule-based plan takes a quarter of a second and an open-model plan about 15 s on a T4 GPU. The test-gated Docker image is 3.6 GB, and the full stack ran on Docker Desktop's single-node Kubernetes cluster once resource requests were sized to its 6.8 GiB of allocatable memory; the 23-test suite passes against the real outputs.</w:t>
       </w:r>
     </w:p>
     <w:p>
@@ -7329,7 +7511,7 @@
           <w:b w:val="0"/>
           <w:i w:val="0"/>
         </w:rPr>
-        <w:t>Radview is an end-to-end, containerised system that turns raw restaurant reviews into aspect-level complaint signals, a calibrated decline forecast with two independent explanations, and a ranked action plan in which every claim is mechanically verified. On real Yelp data its fine-tuned DistilBERT is the most accurate aspect model on human-labelled SemEval sentences, especially for detecting complaints; its agent produced 53 fully grounded plans while rejecting every fabricated claim; and its GRU is the best multi-signal forecaster. Our main contributions are the aspect-to-action pipeline evaluated on real data, the five-axis verifier with an adversarial test, and a reproducible cloud-native deployment.</w:t>
+        <w:t>Radview is an end-to-end, containerised system that turns raw restaurant reviews into aspect-level complaint signals, a calibrated decline forecast with two independent explanations, and a ranked action plan in which every claim is mechanically verified. On real Yelp data its fine-tuned DistilBERT is the most accurate aspect model on human-labelled SemEval sentences, especially for detecting complaints; its agent produced 53 fully grounded plans while rejecting every fabricated claim, and kept a free open model's unsupported claims (31% of its drafts) away from owners; and its GRU is the best multi-signal forecaster. Our main contributions are the aspect-to-action pipeline evaluated on real data, the five-axis verifier with an adversarial test, and a reproducible cloud-native deployment.</w:t>
       </w:r>
     </w:p>
     <w:p>
@@ -7343,7 +7525,7 @@
           <w:b w:val="0"/>
           <w:i w:val="0"/>
         </w:rPr>
-        <w:t>The evaluation also contradicted two of our expectations, and we consider reporting this part of the contribution: a rating-trend logistic regression forecasts decline marginally better than any model that uses aspect signals, and complaint spikes do not anticipate declines at monthly granularity. Open limitations are the COVID-era test window; weak labels and an evaluation set without a cleanliness category; low review volumes that make individual rates noisy; attributions and star costs that are associational rather than causal; a verifier that checks traceability, not truth; and an LLM planner that still has to be measured. Future work: re-test on a pre-pandemic window; redefine the spike target as lasting damage relative to the pre-spike baseline; hand-label the exported 300-review Yelp sample; extend to several cities; evaluate the Claude planner and collect owner usefulness ratings, which the dashboard already records.</w:t>
+        <w:t>The evaluation also contradicted two of our expectations, and we consider reporting this part of the contribution: a rating-trend logistic regression forecasts decline marginally better than any model that uses aspect signals, and complaint spikes do not anticipate declines at monthly granularity. Open limitations are the COVID-era test window; weak labels and an evaluation set without a cleanliness category; low review volumes that make individual rates noisy; attributions and star costs that are associational rather than causal; a verifier that checks traceability, not truth; and a small open LLM planner whose claims pass verification only 69% of the time. Future work: re-test on a pre-pandemic window; redefine the spike target as lasting damage relative to the pre-spike baseline; hand-label the exported 300-review Yelp sample; extend to several cities; compare a frontier LLM planner such as Claude with the open model, and collect owner usefulness ratings, which the dashboard already records.</w:t>
       </w:r>
     </w:p>
     <w:p>

</xml_diff>